<commit_message>
Supplementary: flat S1-S7 headings, no sub-sections
Co-Authored-By: Claude Sonnet 5.5 <noreply@anthropic.com>
Claude-Session: https://claude.ai/code/session_01Y1g9vByMLTE8eGJ9K81zt6
</commit_message>
<xml_diff>
--- a/Supplementary_reorganized.docx
+++ b/Supplementary_reorganized.docx
@@ -845,17 +845,6 @@
       </w:pPr>
       <w:r>
         <w:t>This section defines the quantities used to evaluate the simulations (Equations S1–S3) and documents the choice of velocity-selection rule (Rules A–D; Table S1 and Figures S1 and S2).</w:t>
-      </w:r>
-    </w:p>
-    <w:p>
-      <w:pPr>
-        <w:pStyle w:val="Heading2"/>
-        <w:spacing w:before="240" w:after="80"/>
-        <w:ind w:firstLine="0"/>
-        <w:jc w:val="left"/>
-      </w:pPr>
-      <w:r>
-        <w:t>S1.1 Corrosion rate</w:t>
       </w:r>
     </w:p>
     <w:p>
@@ -1252,19 +1241,6 @@
     </w:p>
     <w:p>
       <w:pPr>
-        <w:pStyle w:val="Heading2"/>
-        <w:tabs>
-          <w:tab w:val="right" w:pos="9360"/>
-        </w:tabs>
-        <w:spacing w:before="240" w:after="80"/>
-        <w:ind w:firstLine="0"/>
-      </w:pPr>
-      <w:r>
-        <w:t>S1.2 pH</w:t>
-      </w:r>
-    </w:p>
-    <w:p>
-      <w:pPr>
         <w:pStyle w:val="BodyText"/>
         <w:keepNext w:val="0"/>
         <w:tabs>
@@ -1507,22 +1483,6 @@
       </w:r>
       <w:r>
         <w:t>is the hydroxide ion concentration in the electrolyte.</w:t>
-      </w:r>
-    </w:p>
-    <w:p>
-      <w:pPr>
-        <w:pStyle w:val="Heading2"/>
-        <w:tabs>
-          <w:tab w:val="right" w:pos="9360"/>
-        </w:tabs>
-        <w:spacing w:before="240" w:after="80"/>
-        <w:ind w:firstLine="0"/>
-        <w:rPr>
-          <w:rFonts w:cs="Times New Roman"/>
-        </w:rPr>
-      </w:pPr>
-      <w:r>
-        <w:t>S1.3 Damköhler number</w:t>
       </w:r>
     </w:p>
     <w:p>
@@ -2280,14 +2240,6 @@
     </w:p>
     <w:p>
       <w:pPr>
-        <w:pStyle w:val="Heading2"/>
-      </w:pPr>
-      <w:r>
-        <w:t>S1.4 Velocity-selection rule</w:t>
-      </w:r>
-    </w:p>
-    <w:p>
-      <w:pPr>
         <w:pStyle w:val="BodyText"/>
         <w:spacing w:before="0" w:after="120" w:line="276" w:lineRule="auto"/>
         <w:ind w:firstLine="0"/>
@@ -4243,14 +4195,6 @@
     </w:p>
     <w:p>
       <w:pPr>
-        <w:pStyle w:val="Heading2"/>
-      </w:pPr>
-      <w:r>
-        <w:t>S2.1 Meshing workflow</w:t>
-      </w:r>
-    </w:p>
-    <w:p>
-      <w:pPr>
         <w:pStyle w:val="BodyText"/>
         <w:spacing w:before="0" w:after="120" w:line="276" w:lineRule="auto"/>
         <w:ind w:firstLine="0"/>
@@ -4464,14 +4408,6 @@
     </w:p>
     <w:p>
       <w:pPr>
-        <w:pStyle w:val="Heading2"/>
-      </w:pPr>
-      <w:r>
-        <w:t>S2.2 Mesh convergence</w:t>
-      </w:r>
-    </w:p>
-    <w:p>
-      <w:pPr>
         <w:pStyle w:val="BodyText"/>
         <w:spacing w:before="0" w:after="120" w:line="276" w:lineRule="auto"/>
         <w:ind w:firstLine="0"/>
@@ -6563,14 +6499,6 @@
           <w:szCs w:val="20"/>
         </w:rPr>
         <w:t>Mesh convergence analysis showing (a) predicted mass loss and (b) relative error as a function of mesh density. Predictions converged with mesh refinement, with &lt;1% error for the final mesh.</w:t>
-      </w:r>
-    </w:p>
-    <w:p>
-      <w:pPr>
-        <w:pStyle w:val="Heading2"/>
-      </w:pPr>
-      <w:r>
-        <w:t>S2.3 Computational geometries</w:t>
       </w:r>
     </w:p>
     <w:p>
@@ -11564,14 +11492,6 @@
       </w:pPr>
       <w:r>
         <w:t>S4. Sensitivity analysis</w:t>
-      </w:r>
-    </w:p>
-    <w:p>
-      <w:pPr>
-        <w:pStyle w:val="Heading2"/>
-      </w:pPr>
-      <w:r>
-        <w:t>S4.1 Parameters and design</w:t>
       </w:r>
     </w:p>
     <w:p>
@@ -14594,15 +14514,6 @@
     </w:tbl>
     <w:p>
       <w:pPr>
-        <w:pStyle w:val="Heading2"/>
-        <w:spacing w:before="280"/>
-      </w:pPr>
-      <w:r>
-        <w:t>S4.2 Time-dependent sensitivity</w:t>
-      </w:r>
-    </w:p>
-    <w:p>
-      <w:pPr>
         <w:pStyle w:val="BodyText"/>
         <w:spacing w:before="0" w:after="120" w:line="276" w:lineRule="auto"/>
         <w:ind w:firstLine="0"/>
@@ -14828,14 +14739,6 @@
       </w:pPr>
       <w:r>
         <w:t>S5. Bayesian calibration and validation</w:t>
-      </w:r>
-    </w:p>
-    <w:p>
-      <w:pPr>
-        <w:pStyle w:val="Heading2"/>
-      </w:pPr>
-      <w:r>
-        <w:t>S5.1 Calibration objective and data</w:t>
       </w:r>
     </w:p>
     <w:p>
@@ -15958,15 +15861,6 @@
     </w:tbl>
     <w:p>
       <w:pPr>
-        <w:pStyle w:val="Heading2"/>
-        <w:spacing w:before="280"/>
-      </w:pPr>
-      <w:r>
-        <w:t>S5.2 Validation and calibration results</w:t>
-      </w:r>
-    </w:p>
-    <w:p>
-      <w:pPr>
         <w:pStyle w:val="BodyText"/>
         <w:spacing w:before="0" w:after="120" w:line="276" w:lineRule="auto"/>
         <w:ind w:firstLine="0"/>
@@ -18644,14 +18538,6 @@
           <w:szCs w:val="20"/>
         </w:rPr>
         <w:t>.</w:t>
-      </w:r>
-    </w:p>
-    <w:p>
-      <w:pPr>
-        <w:pStyle w:val="Heading2"/>
-      </w:pPr>
-      <w:r>
-        <w:t>S5.3 Optimizer settings</w:t>
       </w:r>
     </w:p>
     <w:p>
@@ -20116,14 +20002,6 @@
     </w:p>
     <w:p>
       <w:pPr>
-        <w:pStyle w:val="Heading2"/>
-      </w:pPr>
-      <w:r>
-        <w:t>S7.1 Stent cross-section</w:t>
-      </w:r>
-    </w:p>
-    <w:p>
-      <w:pPr>
         <w:pStyle w:val="BodyText"/>
         <w:keepNext/>
         <w:spacing w:before="200" w:after="0" w:line="240" w:lineRule="auto"/>
@@ -20321,14 +20199,6 @@
           <w:szCs w:val="20"/>
         </w:rPr>
         <w:t xml:space="preserve"> h of immersion.</w:t>
-      </w:r>
-    </w:p>
-    <w:p>
-      <w:pPr>
-        <w:pStyle w:val="Heading2"/>
-      </w:pPr>
-      <w:r>
-        <w:t>S7.2 Controlled geometric studies</w:t>
       </w:r>
     </w:p>
     <w:p>
@@ -24238,7 +24108,7 @@
     <w:pPr>
       <w:keepNext/>
       <w:keepLines/>
-      <w:spacing w:before="360" w:after="120"/>
+      <w:spacing w:before="320" w:after="120"/>
       <w:ind w:left="432" w:hanging="432"/>
       <w:jc w:val="left"/>
       <w:outlineLvl w:val="0"/>
@@ -24248,7 +24118,7 @@
       <w:b/>
       <w:i w:val="0"/>
       <w:color w:val="000000"/>
-      <w:sz w:val="28"/>
+      <w:sz w:val="24"/>
       <w:szCs w:val="40"/>
     </w:rPr>
   </w:style>

</xml_diff>

<commit_message>
Supplementary: replace Figure S8 with corrected 0-672 h version
Co-Authored-By: Claude Sonnet 5.5 <noreply@anthropic.com>
Claude-Session: https://claude.ai/code/session_01Y1g9vByMLTE8eGJ9K81zt6
</commit_message>
<xml_diff>
--- a/Supplementary_reorganized.docx
+++ b/Supplementary_reorganized.docx
@@ -19960,7 +19960,7 @@
         </w:rPr>
         <w:drawing>
           <wp:inline distT="0" distB="0" distL="0" distR="0" wp14:anchorId="44C6F2E3" wp14:editId="40E8B41C">
-            <wp:extent cx="5731510" cy="2677795"/>
+            <wp:extent cx="5731510" cy="2676615"/>
             <wp:effectExtent l="0" t="0" r="2540" b="8255"/>
             <wp:docPr id="14" name="Picture 14"/>
             <wp:cNvGraphicFramePr>
@@ -19991,7 +19991,7 @@
                   <pic:spPr bwMode="auto">
                     <a:xfrm>
                       <a:off x="0" y="0"/>
-                      <a:ext cx="5731510" cy="2677795"/>
+                      <a:ext cx="5731510" cy="2676615"/>
                     </a:xfrm>
                     <a:prstGeom prst="rect">
                       <a:avLst/>

</xml_diff>

<commit_message>
Supplementary: replace Figure S6 with updated version
Co-Authored-By: Claude Sonnet 5.5 <noreply@anthropic.com>
Claude-Session: https://claude.ai/code/session_01Y1g9vByMLTE8eGJ9K81zt6
</commit_message>
<xml_diff>
--- a/Supplementary_reorganized.docx
+++ b/Supplementary_reorganized.docx
@@ -18238,7 +18238,7 @@
         </w:rPr>
         <w:drawing>
           <wp:inline distT="0" distB="0" distL="0" distR="0" wp14:anchorId="67991887" wp14:editId="2929B301">
-            <wp:extent cx="5731510" cy="3407410"/>
+            <wp:extent cx="5731510" cy="3407382"/>
             <wp:effectExtent l="0" t="0" r="2540" b="2540"/>
             <wp:docPr id="3" name="Picture 3"/>
             <wp:cNvGraphicFramePr>
@@ -18266,7 +18266,7 @@
                   <pic:spPr>
                     <a:xfrm>
                       <a:off x="0" y="0"/>
-                      <a:ext cx="5731510" cy="3407410"/>
+                      <a:ext cx="5731510" cy="3407382"/>
                     </a:xfrm>
                     <a:prstGeom prst="rect">
                       <a:avLst/>

</xml_diff>

<commit_message>
Supplementary: label literature data as literature (Figs S1, S6a, captions, text)
Co-Authored-By: Claude Sonnet 5.5 <noreply@anthropic.com>
Claude-Session: https://claude.ai/code/session_01Y1g9vByMLTE8eGJ9K81zt6
</commit_message>
<xml_diff>
--- a/Supplementary_reorganized.docx
+++ b/Supplementary_reorganized.docx
@@ -2174,19 +2174,19 @@
         <w:rPr>
           <w:rFonts w:cs="Times New Roman"/>
         </w:rPr>
-        <w:t xml:space="preserve">Four velocity-selection formulations were evaluated against experimental </w:t>
+        <w:t xml:space="preserve">Four velocity-selection formulations were evaluated against literature Zn degradation data</w:t>
       </w:r>
       <w:r>
         <w:rPr>
           <w:rFonts w:cs="Times New Roman"/>
         </w:rPr>
-        <w:t>Zn</w:t>
+        <w:t xml:space="preserve"/>
       </w:r>
       <w:r>
         <w:rPr>
           <w:rFonts w:cs="Times New Roman"/>
         </w:rPr>
-        <w:t xml:space="preserve"> degradation data. The candidate formulations were: </w:t>
+        <w:t xml:space="preserve">. The candidate formulations were: </w:t>
       </w:r>
     </w:p>
     <w:p>
@@ -3207,7 +3207,7 @@
           <w:sz w:val="20"/>
           <w:szCs w:val="20"/>
         </w:rPr>
-        <w:t xml:space="preserve">Experimental and predicted cumulative mass loss obtained using four velocity-selection formulations. Rule A (hard minimum) </w:t>
+        <w:t xml:space="preserve">Literature and predicted cumulative mass loss obtained using four velocity-selection formulations. Rule A (hard minimum) </w:t>
       </w:r>
       <w:r>
         <w:rPr>
@@ -3215,7 +3215,7 @@
           <w:sz w:val="20"/>
           <w:szCs w:val="20"/>
         </w:rPr>
-        <w:t>best matched</w:t>
+        <w:t xml:space="preserve">best matched the literature data</w:t>
       </w:r>
       <w:r>
         <w:rPr>
@@ -3223,7 +3223,7 @@
           <w:sz w:val="20"/>
           <w:szCs w:val="20"/>
         </w:rPr>
-        <w:t xml:space="preserve"> the experimental data (RMSE = 0.0568%) and was therefore adopted in the final model. Rules B and C </w:t>
+        <w:t xml:space="preserve"> (RMSE = 0.0568%) and was therefore adopted in the final model. Rules B and C </w:t>
       </w:r>
       <w:r>
         <w:rPr>
@@ -3589,7 +3589,7 @@
           <w:sz w:val="20"/>
           <w:szCs w:val="20"/>
         </w:rPr>
-        <w:t xml:space="preserve"> experimental mass-loss measurements and was adopted in the final model.</w:t>
+        <w:t xml:space="preserve"> literature mass-loss measurements and was adopted in the final model.</w:t>
       </w:r>
     </w:p>
     <w:tbl>
@@ -18365,7 +18365,7 @@
           <w:sz w:val="20"/>
           <w:szCs w:val="20"/>
         </w:rPr>
-        <w:t>Bayesian calibration results: (a) simulated and experimental mass loss, (b) normalized parameter trajectories, and (c–e) RMSE response surfaces for pairwise combinations of</w:t>
+        <w:t xml:space="preserve">Bayesian calibration results: (a) simulated and literature mass loss, (b) normalized parameter trajectories, and (c–e) RMSE response surfaces for pairwise combinations of</w:t>
       </w:r>
       <w:r>
         <w:rPr>

</xml_diff>

<commit_message>
Supplementary/manuscript: table corrections, S9 caption, equation lead-ins, Time (hours) labels, pure Zn legend
Co-Authored-By: Claude Sonnet 5.5 <noreply@anthropic.com>
Claude-Session: https://claude.ai/code/session_01Y1g9vByMLTE8eGJ9K81zt6
</commit_message>
<xml_diff>
--- a/Supplementary_reorganized.docx
+++ b/Supplementary_reorganized.docx
@@ -4132,6 +4132,17 @@
     <w:p>
       <w:pPr>
         <w:pStyle w:val="BodyText"/>
+        <w:spacing w:before="0" w:after="120" w:line="276" w:lineRule="auto"/>
+        <w:ind w:firstLine="0"/>
+        <w:jc w:val="both"/>
+      </w:pPr>
+      <w:r>
+        <w:t>Table S2 and Figure S3 report the mesh convergence study, and Table S3 compares adaptive and uniform meshes of similar size.</w:t>
+      </w:r>
+    </w:p>
+    <w:p>
+      <w:pPr>
+        <w:pStyle w:val="BodyText"/>
         <w:keepNext/>
         <w:spacing w:before="0" w:after="120" w:line="276" w:lineRule="auto"/>
         <w:ind w:firstLine="0"/>
@@ -4343,12 +4354,13 @@
     <w:p>
       <w:pPr>
         <w:pStyle w:val="BodyText"/>
+        <w:keepNext w:val="0"/>
         <w:spacing w:before="0" w:after="120" w:line="276" w:lineRule="auto"/>
         <w:ind w:firstLine="0"/>
         <w:jc w:val="both"/>
       </w:pPr>
       <w:r>
-        <w:t>Table S2 and Figure S3 report the mesh convergence study, and Table S3 compares adaptive and uniform meshes of similar size.</w:t>
+        <w:t>where MassLoss_Li is the predicted mass loss for mesh level Li and MassLoss_Reference is the predicted mass loss for the reference mesh (21.25 million elements).</w:t>
       </w:r>
     </w:p>
     <w:p>
@@ -4750,7 +4762,7 @@
                 <w:szCs w:val="20"/>
                 <w:lang w:eastAsia="en-US"/>
               </w:rPr>
-              <w:t>1465.6</w:t>
+              <w:t xml:space="preserve">1465.8</w:t>
             </w:r>
           </w:p>
         </w:tc>
@@ -4875,7 +4887,7 @@
                 <w:szCs w:val="20"/>
                 <w:lang w:eastAsia="en-US"/>
               </w:rPr>
-              <w:t>441.4</w:t>
+              <w:t xml:space="preserve">441.6</w:t>
             </w:r>
           </w:p>
         </w:tc>
@@ -5375,7 +5387,7 @@
                 <w:szCs w:val="20"/>
                 <w:lang w:eastAsia="en-US"/>
               </w:rPr>
-              <w:t>0.82</w:t>
+              <w:t xml:space="preserve">0.87</w:t>
             </w:r>
           </w:p>
         </w:tc>
@@ -5936,7 +5948,7 @@
                 <w:szCs w:val="20"/>
                 <w:lang w:eastAsia="en-US"/>
               </w:rPr>
-              <w:t>3011</w:t>
+              <w:t xml:space="preserve">3007.8</w:t>
             </w:r>
           </w:p>
         </w:tc>
@@ -9855,7 +9867,7 @@
                 <w:szCs w:val="20"/>
                 <w:lang w:eastAsia="en-US"/>
               </w:rPr>
-              <w:t>60,953</w:t>
+              <w:t xml:space="preserve">2,592</w:t>
             </w:r>
           </w:p>
         </w:tc>
@@ -12127,6 +12139,16 @@
                             <w:szCs w:val="20"/>
                             <w:lang w:eastAsia="en-US"/>
                           </w:rPr>
+                          <m:t xml:space="preserve"> </m:t>
+                        </m:r>
+                        <m:r>
+                          <w:rPr>
+                            <w:rFonts w:ascii="Cambria Math" w:hAnsi="Cambria Math" w:cs="Times New Roman"/>
+                            <w:color w:val="000000"/>
+                            <w:sz w:val="20"/>
+                            <w:szCs w:val="20"/>
+                            <w:lang w:eastAsia="en-US"/>
+                          </w:rPr>
                           <m:t>g</m:t>
                         </m:r>
                       </m:e>
@@ -12146,6 +12168,16 @@
                         </m:r>
                       </m:sup>
                     </m:sSup>
+                    <m:r>
+                      <w:rPr>
+                        <w:rFonts w:ascii="Cambria Math" w:hAnsi="Cambria Math" w:cs="Times New Roman"/>
+                        <w:color w:val="000000"/>
+                        <w:sz w:val="20"/>
+                        <w:szCs w:val="20"/>
+                        <w:lang w:eastAsia="en-US"/>
+                      </w:rPr>
+                      <m:t xml:space="preserve"> </m:t>
+                    </m:r>
                     <m:r>
                       <w:rPr>
                         <w:rFonts w:ascii="Cambria Math" w:hAnsi="Cambria Math" w:cs="Times New Roman"/>
@@ -12633,6 +12665,16 @@
                         </m:r>
                       </m:sup>
                     </m:sSup>
+                    <m:r>
+                      <w:rPr>
+                        <w:rFonts w:ascii="Cambria Math" w:hAnsi="Cambria Math" w:cs="Times New Roman"/>
+                        <w:color w:val="000000"/>
+                        <w:sz w:val="20"/>
+                        <w:szCs w:val="20"/>
+                        <w:lang w:eastAsia="en-US"/>
+                      </w:rPr>
+                      <m:t xml:space="preserve"> </m:t>
+                    </m:r>
                     <m:r>
                       <w:rPr>
                         <w:rFonts w:ascii="Cambria Math" w:hAnsi="Cambria Math" w:cs="Times New Roman"/>
@@ -13290,6 +13332,16 @@
                         <w:szCs w:val="20"/>
                         <w:lang w:eastAsia="en-US"/>
                       </w:rPr>
+                      <m:t xml:space="preserve"> </m:t>
+                    </m:r>
+                    <m:r>
+                      <w:rPr>
+                        <w:rFonts w:ascii="Cambria Math" w:hAnsi="Cambria Math" w:cs="Times New Roman"/>
+                        <w:color w:val="000000"/>
+                        <w:sz w:val="20"/>
+                        <w:szCs w:val="20"/>
+                        <w:lang w:eastAsia="en-US"/>
+                      </w:rPr>
                       <m:t>h</m:t>
                     </m:r>
                   </m:e>
@@ -13524,6 +13576,16 @@
                         <w:szCs w:val="20"/>
                         <w:lang w:eastAsia="en-US"/>
                       </w:rPr>
+                      <m:t xml:space="preserve"> </m:t>
+                    </m:r>
+                    <m:r>
+                      <w:rPr>
+                        <w:rFonts w:ascii="Cambria Math" w:hAnsi="Cambria Math" w:cs="Times New Roman"/>
+                        <w:color w:val="000000"/>
+                        <w:sz w:val="20"/>
+                        <w:szCs w:val="20"/>
+                        <w:lang w:eastAsia="en-US"/>
+                      </w:rPr>
                       <m:t>h</m:t>
                     </m:r>
                   </m:e>
@@ -13750,6 +13812,16 @@
                         </m:r>
                       </m:sup>
                     </m:sSup>
+                    <m:r>
+                      <w:rPr>
+                        <w:rFonts w:ascii="Cambria Math" w:hAnsi="Cambria Math" w:cs="Times New Roman"/>
+                        <w:color w:val="000000"/>
+                        <w:sz w:val="20"/>
+                        <w:szCs w:val="20"/>
+                        <w:lang w:eastAsia="en-US"/>
+                      </w:rPr>
+                      <m:t xml:space="preserve"> </m:t>
+                    </m:r>
                     <m:r>
                       <w:rPr>
                         <w:rFonts w:ascii="Cambria Math" w:hAnsi="Cambria Math" w:cs="Times New Roman"/>
@@ -14994,6 +15066,18 @@
     <w:p>
       <w:pPr>
         <w:pStyle w:val="BodyText"/>
+        <w:keepNext w:val="0"/>
+        <w:spacing w:before="0" w:after="120" w:line="276" w:lineRule="auto"/>
+        <w:ind w:firstLine="0"/>
+        <w:jc w:val="both"/>
+      </w:pPr>
+      <w:r>
+        <w:t>where n is the number of literature data points, and MassLoss_sim(t_i) and MassLoss_exp(t_i) are the simulated and literature mass loss at time t_i, respectively.</w:t>
+      </w:r>
+    </w:p>
+    <w:p>
+      <w:pPr>
+        <w:pStyle w:val="BodyText"/>
         <w:spacing w:before="0" w:after="120" w:line="276" w:lineRule="auto"/>
         <w:ind w:firstLine="0"/>
         <w:jc w:val="both"/>
@@ -15211,7 +15295,7 @@
                 <w:szCs w:val="20"/>
                 <w:lang w:eastAsia="en-US"/>
               </w:rPr>
-              <w:t>Time (h)</w:t>
+              <w:t>Time (hours)</w:t>
             </w:r>
           </w:p>
         </w:tc>
@@ -16026,7 +16110,7 @@
                 <w:szCs w:val="20"/>
                 <w:lang w:eastAsia="en-US"/>
               </w:rPr>
-              <w:t>Time (h)</w:t>
+              <w:t>Time (hours)</w:t>
             </w:r>
           </w:p>
         </w:tc>
@@ -16926,7 +17010,7 @@
           <w:sz w:val="20"/>
           <w:szCs w:val="20"/>
         </w:rPr>
-        <w:t xml:space="preserve">Calibrated model validation through comparison of predicted mass loss and literature-reported mass loss for Zn degradation.</w:t>
+        <w:t xml:space="preserve">Final calibrated-model predictions of mass loss compared with the literature mass-loss data used for calibration (Liu et al. 2018).</w:t>
       </w:r>
     </w:p>
     <w:tbl>
@@ -16991,7 +17075,7 @@
                 <w:szCs w:val="20"/>
                 <w:lang w:eastAsia="en-US"/>
               </w:rPr>
-              <w:t>Time (h)</w:t>
+              <w:t>Time (hours)</w:t>
             </w:r>
           </w:p>
         </w:tc>
@@ -19332,7 +19416,7 @@
                 <w:szCs w:val="20"/>
                 <w:lang w:eastAsia="en-US"/>
               </w:rPr>
-              <w:t>External probe points</w:t>
+              <w:t xml:space="preserve">Initial sampling</w:t>
             </w:r>
           </w:p>
         </w:tc>
@@ -19363,7 +19447,7 @@
                 <w:szCs w:val="20"/>
                 <w:lang w:eastAsia="en-US"/>
               </w:rPr>
-              <w:t>9</w:t>
+              <w:t xml:space="preserve">12-point Latin hypercube design (iterations 1–12)</w:t>
             </w:r>
           </w:p>
         </w:tc>
@@ -19399,7 +19483,7 @@
                 <w:szCs w:val="20"/>
                 <w:lang w:eastAsia="en-US"/>
               </w:rPr>
-              <w:t>Corner-point evaluations</w:t>
+              <w:t xml:space="preserve">Acquisition function</w:t>
             </w:r>
           </w:p>
         </w:tc>
@@ -19430,7 +19514,7 @@
                 <w:szCs w:val="20"/>
                 <w:lang w:eastAsia="en-US"/>
               </w:rPr>
-              <w:t>8</w:t>
+              <w:t xml:space="preserve">Expected improvement</w:t>
             </w:r>
           </w:p>
         </w:tc>
@@ -19466,7 +19550,7 @@
                 <w:szCs w:val="20"/>
                 <w:lang w:eastAsia="en-US"/>
               </w:rPr>
-              <w:t>Warm-start data</w:t>
+              <w:t xml:space="preserve">Total iterations</w:t>
             </w:r>
           </w:p>
         </w:tc>
@@ -19497,7 +19581,7 @@
                 <w:szCs w:val="20"/>
                 <w:lang w:eastAsia="en-US"/>
               </w:rPr>
-              <w:t>Previous runs and training dataset</w:t>
+              <w:t xml:space="preserve">32 (optimum at iteration 22)</w:t>
             </w:r>
           </w:p>
         </w:tc>
@@ -20233,7 +20317,7 @@
           <w:sz w:val="20"/>
           <w:szCs w:val="20"/>
         </w:rPr>
-        <w:t xml:space="preserve">Geometric and computational parameters of the controlled test structures used in main-text Figure 8.</w:t>
+        <w:t xml:space="preserve">Geometric and computational parameters of the controlled test structures used in Figure 8.</w:t>
       </w:r>
     </w:p>
     <w:tbl>

</xml_diff>

<commit_message>
Supplementary: use updated Figure S4 (2000 px)
Co-Authored-By: Claude Sonnet 5.5 <noreply@anthropic.com>
Claude-Session: https://claude.ai/code/session_01Y1g9vByMLTE8eGJ9K81zt6
</commit_message>
<xml_diff>
--- a/Supplementary_reorganized.docx
+++ b/Supplementary_reorganized.docx
@@ -6472,7 +6472,7 @@
         <w:lastRenderedPageBreak/>
         <w:drawing>
           <wp:inline distT="0" distB="0" distL="0" distR="0" wp14:anchorId="38A7DD9F" wp14:editId="1AEDEAC4">
-            <wp:extent cx="5731510" cy="4399915"/>
+            <wp:extent cx="5731510" cy="4504966"/>
             <wp:effectExtent l="0" t="0" r="2540" b="635"/>
             <wp:docPr id="5" name="Picture 5"/>
             <wp:cNvGraphicFramePr>
@@ -6500,7 +6500,7 @@
                   <pic:spPr>
                     <a:xfrm>
                       <a:off x="0" y="0"/>
-                      <a:ext cx="5731510" cy="4399915"/>
+                      <a:ext cx="5731510" cy="4504966"/>
                     </a:xfrm>
                     <a:prstGeom prst="rect">
                       <a:avLst/>

</xml_diff>

<commit_message>
Supplementary: software versions from Dissolve dependency list, expanded references
Co-Authored-By: Claude Sonnet 5.5 <noreply@anthropic.com>
Claude-Session: https://claude.ai/code/session_01Y1g9vByMLTE8eGJ9K81zt6
</commit_message>
<xml_diff>
--- a/Supplementary_reorganized.docx
+++ b/Supplementary_reorganized.docx
@@ -4123,7 +4123,7 @@
         <w:jc w:val="both"/>
       </w:pPr>
       <w:r>
-        <w:t xml:space="preserve">STL implant geometries were converted into tetrahedral finite-element meshes using a Gmsh-based workflow [1]. Adaptive refinement was applied at the Zn-electrolyte interface, and the resulting Zn-electrolyte meshes were exported in FreeFEM/Medit (.mesh) format for all simulations in FreeFEM++ [2].</w:t>
+        <w:t xml:space="preserve">STL implant geometries were converted into tetrahedral finite-element meshes using a Gmsh (v4.13.1)-based workflow [1], with TetGen [2] for tetrahedralization and MMG [3] for adaptive remeshing. Adaptive refinement was applied at the Zn-electrolyte interface, and the resulting Zn-electrolyte meshes were exported in FreeFEM/Medit (.mesh) format for all simulations in FreeFEM (v4.14) [4].</w:t>
       </w:r>
       <w:r>
         <w:t xml:space="preserve"> </w:t>
@@ -6611,7 +6611,7 @@
         <w:jc w:val="both"/>
       </w:pPr>
       <w:r>
-        <w:t xml:space="preserve">Table S4 lists the mesh, numerical integration, software and boundary-condition settings used for the disc calibration, disc validation and stent simulations. The simulations were run in FreeFEM++ [2], and the level-set function was reinitialized with the fast marching method [3].</w:t>
+        <w:t xml:space="preserve">Table S4 lists the mesh, numerical integration, software and boundary-condition settings used for the disc calibration, disc validation and stent simulations. The simulations were run in FreeFEM (v4.14) [4] with PETSc [5] and Open MPI [6], and the level-set function was reinitialized with the fast marching method [7]. Geometry processing and post-processing used scikit-image [8], trimesh [9], meshio [10], SciPy [11], Matplotlib [12] and ParaView [13].</w:t>
       </w:r>
     </w:p>
     <w:p>
@@ -10744,7 +10744,7 @@
                 <w:szCs w:val="20"/>
                 <w:lang w:eastAsia="en-US"/>
               </w:rPr>
-              <w:t>FreeFEM++</w:t>
+              <w:t>FreeFEM (v4.14)</w:t>
             </w:r>
           </w:p>
         </w:tc>
@@ -10775,7 +10775,7 @@
                 <w:szCs w:val="20"/>
                 <w:lang w:eastAsia="en-US"/>
               </w:rPr>
-              <w:t>FreeFEM++</w:t>
+              <w:t>FreeFEM (v4.14)</w:t>
             </w:r>
           </w:p>
         </w:tc>
@@ -10806,7 +10806,7 @@
                 <w:szCs w:val="20"/>
                 <w:lang w:eastAsia="en-US"/>
               </w:rPr>
-              <w:t>FreeFEM++</w:t>
+              <w:t>FreeFEM (v4.14)</w:t>
             </w:r>
           </w:p>
         </w:tc>
@@ -11448,7 +11448,7 @@
         <w:jc w:val="both"/>
       </w:pPr>
       <w:r>
-        <w:t xml:space="preserve">Table S5 lists the parameters varied in the Morris analysis [4], performed with SALib [5], and Table S6 gives the design settings.</w:t>
+        <w:t xml:space="preserve">Table S5 lists the parameters varied in the Morris analysis [14], performed with SALib [15], and Table S6 gives the design settings.</w:t>
       </w:r>
     </w:p>
     <w:p>
@@ -14755,7 +14755,7 @@
         <w:jc w:val="both"/>
       </w:pPr>
       <w:r>
-        <w:t xml:space="preserve">Optimal parameters were identified by minimizing the RMSE between predicted and literature-reported 14-day mass-loss measurements. The Bayesian optimization used a Gaussian process surrogate [6] with the expected improvement acquisition function [7], initialized with a Latin hypercube design [8]. The literature data are from Liu et al. [9].</w:t>
+        <w:t xml:space="preserve">Optimal parameters were identified by minimizing the RMSE between predicted and literature-reported 14-day mass-loss measurements. The Bayesian optimization used a Gaussian process surrogate [16] with the expected improvement acquisition function [17], initialized with a Latin hypercube design [18]. The literature data are from Liu et al. [19].</w:t>
       </w:r>
     </w:p>
     <w:p>
@@ -22806,7 +22806,7 @@
         </w:rPr>
         <w:t>[2]</w:t>
         <w:tab/>
-        <w:t>F. Hecht, J. Numer. Math. 2012, 20, 251. https://doi.org/10.1515/jnum-2012-0013.</w:t>
+        <w:t>H. Si, ACM Trans. Math. Softw. 2015, 41, 11. https://doi.org/10.1145/2629697.</w:t>
       </w:r>
     </w:p>
     <w:p>
@@ -22824,7 +22824,7 @@
         </w:rPr>
         <w:t>[3]</w:t>
         <w:tab/>
-        <w:t>J. A. Sethian, Proc. Natl. Acad. Sci. USA 1996, 93, 1591. https://doi.org/10.1073/pnas.93.4.1591.</w:t>
+        <w:t>C. Dapogny, C. Dobrzynski, P. Frey, J. Comput. Phys. 2014, 262, 358. https://doi.org/10.1016/j.jcp.2014.01.005.</w:t>
       </w:r>
     </w:p>
     <w:p>
@@ -22842,7 +22842,7 @@
         </w:rPr>
         <w:t>[4]</w:t>
         <w:tab/>
-        <w:t>M. D. Morris, Technometrics 1991, 33, 161. https://doi.org/10.1080/00401706.1991.10484804.</w:t>
+        <w:t>F. Hecht, J. Numer. Math. 2012, 20, 251. https://doi.org/10.1515/jnum-2012-0013.</w:t>
       </w:r>
     </w:p>
     <w:p>
@@ -22860,7 +22860,7 @@
         </w:rPr>
         <w:t>[5]</w:t>
         <w:tab/>
-        <w:t>J. Herman, W. Usher, J. Open Source Softw. 2017, 2, 97. https://doi.org/10.21105/joss.00097.</w:t>
+        <w:t>S. Balay, S. Abhyankar, M. F. Adams, et al., PETSc/TAO Users Manual, Argonne National Laboratory, Lemont, IL, USA 2024, ANL-21/39 (Rev. 3.22). https://petsc.org.</w:t>
       </w:r>
     </w:p>
     <w:p>
@@ -22878,7 +22878,7 @@
         </w:rPr>
         <w:t>[6]</w:t>
         <w:tab/>
-        <w:t>C. E. Rasmussen, C. K. I. Williams, Gaussian Processes for Machine Learning, MIT Press, Cambridge, MA, USA 2006.</w:t>
+        <w:t>E. Gabriel, G. E. Fagg, G. Bosilca, et al., in Recent Advances in Parallel Virtual Machine and Message Passing Interface (Eds: D. Kranzlmüller, P. Kacsuk, J. Dongarra), Springer, Berlin, Heidelberg, Germany 2004, pp. 97–104. https://doi.org/10.1007/978-3-540-30218-6_19.</w:t>
       </w:r>
     </w:p>
     <w:p>
@@ -22896,7 +22896,7 @@
         </w:rPr>
         <w:t>[7]</w:t>
         <w:tab/>
-        <w:t>D. R. Jones, M. Schonlau, W. J. Welch, J. Glob. Optim. 1998, 13, 455. https://doi.org/10.1023/A:1008306431147.</w:t>
+        <w:t>J. A. Sethian, Proc. Natl. Acad. Sci. USA 1996, 93, 1591. https://doi.org/10.1073/pnas.93.4.1591.</w:t>
       </w:r>
     </w:p>
     <w:p>
@@ -22914,7 +22914,7 @@
         </w:rPr>
         <w:t>[8]</w:t>
         <w:tab/>
-        <w:t>M. D. McKay, R. J. Beckman, W. J. Conover, Technometrics 1979, 21, 239. https://doi.org/10.1080/00401706.1979.10489755.</w:t>
+        <w:t>S. van der Walt, J. L. Schönberger, J. Nunez-Iglesias, et al., PeerJ 2014, 2, e453. https://doi.org/10.7717/peerj.453.</w:t>
       </w:r>
     </w:p>
     <w:p>
@@ -22931,6 +22931,186 @@
           <w:sz w:val="20"/>
         </w:rPr>
         <w:t>[9]</w:t>
+        <w:tab/>
+        <w:t>M. Dawson-Haggerty, et al., trimesh, https://trimesh.org (accessed: October 2026).</w:t>
+      </w:r>
+    </w:p>
+    <w:p>
+      <w:pPr>
+        <w:spacing w:after="60" w:line="240" w:lineRule="auto"/>
+        <w:tabs>
+          <w:tab w:val="left" w:pos="510"/>
+        </w:tabs>
+        <w:ind w:left="510" w:hanging="510"/>
+        <w:jc w:val="left"/>
+      </w:pPr>
+      <w:r>
+        <w:rPr>
+          <w:sz w:val="20"/>
+        </w:rPr>
+        <w:t>[10]</w:t>
+        <w:tab/>
+        <w:t>N. Schlömer, et al., meshio: Tools for mesh files, https://doi.org/10.5281/zenodo.1173115.</w:t>
+      </w:r>
+    </w:p>
+    <w:p>
+      <w:pPr>
+        <w:spacing w:after="60" w:line="240" w:lineRule="auto"/>
+        <w:tabs>
+          <w:tab w:val="left" w:pos="510"/>
+        </w:tabs>
+        <w:ind w:left="510" w:hanging="510"/>
+        <w:jc w:val="left"/>
+      </w:pPr>
+      <w:r>
+        <w:rPr>
+          <w:sz w:val="20"/>
+        </w:rPr>
+        <w:t>[11]</w:t>
+        <w:tab/>
+        <w:t>P. Virtanen, R. Gommers, T. E. Oliphant, et al., Nat. Methods 2020, 17, 261. https://doi.org/10.1038/s41592-019-0686-2.</w:t>
+      </w:r>
+    </w:p>
+    <w:p>
+      <w:pPr>
+        <w:spacing w:after="60" w:line="240" w:lineRule="auto"/>
+        <w:tabs>
+          <w:tab w:val="left" w:pos="510"/>
+        </w:tabs>
+        <w:ind w:left="510" w:hanging="510"/>
+        <w:jc w:val="left"/>
+      </w:pPr>
+      <w:r>
+        <w:rPr>
+          <w:sz w:val="20"/>
+        </w:rPr>
+        <w:t>[12]</w:t>
+        <w:tab/>
+        <w:t>J. D. Hunter, Comput. Sci. Eng. 2007, 9, 90. https://doi.org/10.1109/MCSE.2007.55.</w:t>
+      </w:r>
+    </w:p>
+    <w:p>
+      <w:pPr>
+        <w:spacing w:after="60" w:line="240" w:lineRule="auto"/>
+        <w:tabs>
+          <w:tab w:val="left" w:pos="510"/>
+        </w:tabs>
+        <w:ind w:left="510" w:hanging="510"/>
+        <w:jc w:val="left"/>
+      </w:pPr>
+      <w:r>
+        <w:rPr>
+          <w:sz w:val="20"/>
+        </w:rPr>
+        <w:t>[13]</w:t>
+        <w:tab/>
+        <w:t>J. Ahrens, B. Geveci, C. Law, in The Visualization Handbook (Eds: C. D. Hansen, C. R. Johnson), Elsevier, Amsterdam, The Netherlands 2005, pp. 717–731.</w:t>
+      </w:r>
+    </w:p>
+    <w:p>
+      <w:pPr>
+        <w:spacing w:after="60" w:line="240" w:lineRule="auto"/>
+        <w:tabs>
+          <w:tab w:val="left" w:pos="510"/>
+        </w:tabs>
+        <w:ind w:left="510" w:hanging="510"/>
+        <w:jc w:val="left"/>
+      </w:pPr>
+      <w:r>
+        <w:rPr>
+          <w:sz w:val="20"/>
+        </w:rPr>
+        <w:t>[14]</w:t>
+        <w:tab/>
+        <w:t>M. D. Morris, Technometrics 1991, 33, 161. https://doi.org/10.1080/00401706.1991.10484804.</w:t>
+      </w:r>
+    </w:p>
+    <w:p>
+      <w:pPr>
+        <w:spacing w:after="60" w:line="240" w:lineRule="auto"/>
+        <w:tabs>
+          <w:tab w:val="left" w:pos="510"/>
+        </w:tabs>
+        <w:ind w:left="510" w:hanging="510"/>
+        <w:jc w:val="left"/>
+      </w:pPr>
+      <w:r>
+        <w:rPr>
+          <w:sz w:val="20"/>
+        </w:rPr>
+        <w:t>[15]</w:t>
+        <w:tab/>
+        <w:t>J. Herman, W. Usher, J. Open Source Softw. 2017, 2, 97. https://doi.org/10.21105/joss.00097.</w:t>
+      </w:r>
+    </w:p>
+    <w:p>
+      <w:pPr>
+        <w:spacing w:after="60" w:line="240" w:lineRule="auto"/>
+        <w:tabs>
+          <w:tab w:val="left" w:pos="510"/>
+        </w:tabs>
+        <w:ind w:left="510" w:hanging="510"/>
+        <w:jc w:val="left"/>
+      </w:pPr>
+      <w:r>
+        <w:rPr>
+          <w:sz w:val="20"/>
+        </w:rPr>
+        <w:t>[16]</w:t>
+        <w:tab/>
+        <w:t>C. E. Rasmussen, C. K. I. Williams, Gaussian Processes for Machine Learning, MIT Press, Cambridge, MA, USA 2006.</w:t>
+      </w:r>
+    </w:p>
+    <w:p>
+      <w:pPr>
+        <w:spacing w:after="60" w:line="240" w:lineRule="auto"/>
+        <w:tabs>
+          <w:tab w:val="left" w:pos="510"/>
+        </w:tabs>
+        <w:ind w:left="510" w:hanging="510"/>
+        <w:jc w:val="left"/>
+      </w:pPr>
+      <w:r>
+        <w:rPr>
+          <w:sz w:val="20"/>
+        </w:rPr>
+        <w:t>[17]</w:t>
+        <w:tab/>
+        <w:t>D. R. Jones, M. Schonlau, W. J. Welch, J. Glob. Optim. 1998, 13, 455. https://doi.org/10.1023/A:1008306431147.</w:t>
+      </w:r>
+    </w:p>
+    <w:p>
+      <w:pPr>
+        <w:spacing w:after="60" w:line="240" w:lineRule="auto"/>
+        <w:tabs>
+          <w:tab w:val="left" w:pos="510"/>
+        </w:tabs>
+        <w:ind w:left="510" w:hanging="510"/>
+        <w:jc w:val="left"/>
+      </w:pPr>
+      <w:r>
+        <w:rPr>
+          <w:sz w:val="20"/>
+        </w:rPr>
+        <w:t>[18]</w:t>
+        <w:tab/>
+        <w:t>M. D. McKay, R. J. Beckman, W. J. Conover, Technometrics 1979, 21, 239. https://doi.org/10.1080/00401706.1979.10489755.</w:t>
+      </w:r>
+    </w:p>
+    <w:p>
+      <w:pPr>
+        <w:spacing w:after="60" w:line="240" w:lineRule="auto"/>
+        <w:tabs>
+          <w:tab w:val="left" w:pos="510"/>
+        </w:tabs>
+        <w:ind w:left="510" w:hanging="510"/>
+        <w:jc w:val="left"/>
+      </w:pPr>
+      <w:r>
+        <w:rPr>
+          <w:sz w:val="20"/>
+        </w:rPr>
+        <w:t>[19]</w:t>
         <w:tab/>
         <w:t>L. Liu, Y. Meng, C. Dong, Y. Yan, A. A. Volinsky, L.-N. Wang, J. Mater. Sci. Technol. 2018, 34, 2271. https://doi.org/10.1016/j.jmst.2018.05.005.</w:t>
       </w:r>

</xml_diff>

<commit_message>
Supplementary: S1 on new page, 1.5 line spacing for body text, one-line gaps around figures and tables
Co-Authored-By: Claude Sonnet 5.5 <noreply@anthropic.com>
Claude-Session: https://claude.ai/code/session_01Y1g9vByMLTE8eGJ9K81zt6
</commit_message>
<xml_diff>
--- a/Supplementary_reorganized.docx
+++ b/Supplementary_reorganized.docx
@@ -752,7 +752,8 @@
     <w:p>
       <w:pPr>
         <w:pStyle w:val="Heading1"/>
-        <w:spacing w:before="280"/>
+        <w:pageBreakBefore/>
+        <w:spacing w:before="360"/>
       </w:pPr>
       <w:r>
         <w:t>S1. Model equations and velocity-selection rule</w:t>
@@ -761,7 +762,7 @@
     <w:p>
       <w:pPr>
         <w:pStyle w:val="BodyText"/>
-        <w:spacing w:before="0" w:after="120" w:line="276" w:lineRule="auto"/>
+        <w:spacing w:before="0" w:after="120" w:line="360" w:lineRule="auto"/>
         <w:ind w:firstLine="0"/>
         <w:jc w:val="both"/>
       </w:pPr>
@@ -958,7 +959,7 @@
         <w:tabs>
           <w:tab w:val="right" w:pos="9360"/>
         </w:tabs>
-        <w:spacing w:before="240" w:after="240"/>
+        <w:spacing w:before="240" w:after="240" w:line="360" w:lineRule="auto"/>
         <w:ind w:firstLine="0"/>
       </w:pPr>
       <w:r>
@@ -1346,7 +1347,7 @@
         <w:tabs>
           <w:tab w:val="right" w:pos="9360"/>
         </w:tabs>
-        <w:spacing w:before="240" w:after="240"/>
+        <w:spacing w:before="240" w:after="240" w:line="360" w:lineRule="auto"/>
         <w:ind w:firstLine="0"/>
       </w:pPr>
       <w:r>
@@ -1855,6 +1856,7 @@
     <w:p>
       <w:pPr>
         <w:pStyle w:val="BodyText"/>
+        <w:spacing w:line="360" w:lineRule="auto"/>
         <w:ind w:firstLine="0"/>
         <w:rPr>
           <w:rFonts w:cs="Times New Roman"/>
@@ -2163,7 +2165,7 @@
     <w:p>
       <w:pPr>
         <w:pStyle w:val="BodyText"/>
-        <w:spacing w:before="0" w:after="120" w:line="276" w:lineRule="auto"/>
+        <w:spacing w:before="0" w:after="120" w:line="360" w:lineRule="auto"/>
         <w:ind w:firstLine="0"/>
         <w:jc w:val="both"/>
         <w:rPr>
@@ -3033,7 +3035,7 @@
     <w:p>
       <w:pPr>
         <w:pStyle w:val="BodyText"/>
-        <w:spacing w:before="0" w:after="120" w:line="276" w:lineRule="auto"/>
+        <w:spacing w:before="0" w:after="120" w:line="360" w:lineRule="auto"/>
         <w:ind w:firstLine="0"/>
         <w:jc w:val="both"/>
         <w:rPr>
@@ -3075,7 +3077,7 @@
       <w:pPr>
         <w:pStyle w:val="BodyText"/>
         <w:keepNext/>
-        <w:spacing w:before="200" w:after="0" w:line="240" w:lineRule="auto"/>
+        <w:spacing w:before="360" w:after="0" w:line="240" w:lineRule="auto"/>
         <w:ind w:firstLine="0"/>
         <w:jc w:val="center"/>
       </w:pPr>
@@ -3125,7 +3127,7 @@
       <w:pPr>
         <w:pStyle w:val="Captions"/>
         <w:keepNext w:val="0"/>
-        <w:spacing w:line="240" w:lineRule="auto" w:before="80" w:after="280"/>
+        <w:spacing w:line="240" w:lineRule="auto" w:before="80" w:after="360"/>
         <w:ind w:firstLine="0"/>
         <w:jc w:val="both"/>
       </w:pPr>
@@ -3246,7 +3248,7 @@
       <w:pPr>
         <w:pStyle w:val="Captions"/>
         <w:keepNext/>
-        <w:spacing w:before="200" w:after="0" w:line="240" w:lineRule="auto"/>
+        <w:spacing w:before="360" w:after="0" w:line="240" w:lineRule="auto"/>
         <w:ind w:firstLine="0"/>
         <w:jc w:val="center"/>
       </w:pPr>
@@ -3309,7 +3311,7 @@
       <w:pPr>
         <w:pStyle w:val="Captions"/>
         <w:keepNext w:val="0"/>
-        <w:spacing w:line="240" w:lineRule="auto" w:before="80" w:after="280"/>
+        <w:spacing w:line="240" w:lineRule="auto" w:before="80" w:after="360"/>
         <w:ind w:firstLine="0"/>
         <w:jc w:val="both"/>
       </w:pPr>
@@ -3482,7 +3484,7 @@
       <w:pPr>
         <w:pStyle w:val="Captions"/>
         <w:keepNext/>
-        <w:spacing w:line="240" w:lineRule="auto" w:before="200" w:after="80"/>
+        <w:spacing w:line="240" w:lineRule="auto" w:before="360" w:after="80"/>
         <w:ind w:firstLine="0"/>
         <w:jc w:val="both"/>
       </w:pPr>
@@ -4109,7 +4111,7 @@
     <w:p>
       <w:pPr>
         <w:pStyle w:val="Heading1"/>
-        <w:spacing w:before="280"/>
+        <w:spacing w:before="360"/>
       </w:pPr>
       <w:r>
         <w:t>S2. Geometry and mesh generation</w:t>
@@ -4118,7 +4120,7 @@
     <w:p>
       <w:pPr>
         <w:pStyle w:val="BodyText"/>
-        <w:spacing w:before="0" w:after="120" w:line="276" w:lineRule="auto"/>
+        <w:spacing w:before="0" w:after="120" w:line="360" w:lineRule="auto"/>
         <w:ind w:firstLine="0"/>
         <w:jc w:val="both"/>
       </w:pPr>
@@ -4132,7 +4134,7 @@
     <w:p>
       <w:pPr>
         <w:pStyle w:val="BodyText"/>
-        <w:spacing w:before="0" w:after="120" w:line="276" w:lineRule="auto"/>
+        <w:spacing w:before="0" w:after="120" w:line="360" w:lineRule="auto"/>
         <w:ind w:firstLine="0"/>
         <w:jc w:val="both"/>
       </w:pPr>
@@ -4144,7 +4146,7 @@
       <w:pPr>
         <w:pStyle w:val="BodyText"/>
         <w:keepNext/>
-        <w:spacing w:before="0" w:after="120" w:line="276" w:lineRule="auto"/>
+        <w:spacing w:before="0" w:after="120" w:line="360" w:lineRule="auto"/>
         <w:ind w:firstLine="0"/>
         <w:jc w:val="both"/>
       </w:pPr>
@@ -4355,7 +4357,7 @@
       <w:pPr>
         <w:pStyle w:val="BodyText"/>
         <w:keepNext w:val="0"/>
-        <w:spacing w:before="0" w:after="120" w:line="276" w:lineRule="auto"/>
+        <w:spacing w:before="0" w:after="120" w:line="360" w:lineRule="auto"/>
         <w:ind w:firstLine="0"/>
         <w:jc w:val="both"/>
       </w:pPr>
@@ -4367,7 +4369,7 @@
       <w:pPr>
         <w:pStyle w:val="Captions"/>
         <w:keepNext/>
-        <w:spacing w:line="240" w:lineRule="auto" w:before="200" w:after="80"/>
+        <w:spacing w:line="240" w:lineRule="auto" w:before="360" w:after="80"/>
         <w:ind w:firstLine="0"/>
         <w:jc w:val="both"/>
       </w:pPr>
@@ -5532,7 +5534,7 @@
       <w:pPr>
         <w:pStyle w:val="Captions"/>
         <w:keepNext/>
-        <w:spacing w:line="240" w:lineRule="auto" w:before="280" w:after="80"/>
+        <w:spacing w:line="240" w:lineRule="auto" w:before="360" w:after="80"/>
         <w:ind w:firstLine="0"/>
         <w:jc w:val="both"/>
       </w:pPr>
@@ -6307,7 +6309,7 @@
       <w:pPr>
         <w:pStyle w:val="BodyText"/>
         <w:keepNext/>
-        <w:spacing w:before="280" w:after="0" w:line="240" w:lineRule="auto"/>
+        <w:spacing w:before="360" w:after="0" w:line="240" w:lineRule="auto"/>
         <w:ind w:firstLine="0"/>
         <w:jc w:val="center"/>
       </w:pPr>
@@ -6362,7 +6364,7 @@
       <w:pPr>
         <w:pStyle w:val="Captions"/>
         <w:keepNext w:val="0"/>
-        <w:spacing w:line="240" w:lineRule="auto" w:before="80" w:after="280"/>
+        <w:spacing w:line="240" w:lineRule="auto" w:before="80" w:after="360"/>
         <w:ind w:firstLine="0"/>
         <w:jc w:val="both"/>
       </w:pPr>
@@ -6450,7 +6452,7 @@
     <w:p>
       <w:pPr>
         <w:pStyle w:val="BodyText"/>
-        <w:spacing w:before="0" w:after="120" w:line="276" w:lineRule="auto"/>
+        <w:spacing w:before="0" w:after="120" w:line="360" w:lineRule="auto"/>
         <w:ind w:firstLine="0"/>
         <w:jc w:val="both"/>
       </w:pPr>
@@ -6461,7 +6463,7 @@
     <w:p>
       <w:pPr>
         <w:keepNext/>
-        <w:spacing w:after="0" w:line="240" w:lineRule="auto" w:before="200"/>
+        <w:spacing w:after="0" w:line="240" w:lineRule="auto" w:before="360"/>
         <w:ind w:firstLine="0"/>
         <w:jc w:val="center"/>
       </w:pPr>
@@ -6517,7 +6519,7 @@
       <w:pPr>
         <w:pStyle w:val="Captions"/>
         <w:keepNext w:val="0"/>
-        <w:spacing w:line="240" w:lineRule="auto" w:before="80" w:after="280"/>
+        <w:spacing w:line="240" w:lineRule="auto" w:before="80" w:after="360"/>
         <w:ind w:firstLine="0"/>
         <w:jc w:val="both"/>
       </w:pPr>
@@ -6606,7 +6608,7 @@
     <w:p>
       <w:pPr>
         <w:pStyle w:val="BodyText"/>
-        <w:spacing w:before="0" w:after="120" w:line="276" w:lineRule="auto"/>
+        <w:spacing w:before="0" w:after="120" w:line="360" w:lineRule="auto"/>
         <w:ind w:firstLine="0"/>
         <w:jc w:val="both"/>
       </w:pPr>
@@ -6618,7 +6620,7 @@
       <w:pPr>
         <w:pStyle w:val="Captions"/>
         <w:keepNext/>
-        <w:spacing w:line="240" w:lineRule="auto" w:before="200" w:after="80"/>
+        <w:spacing w:line="240" w:lineRule="auto" w:before="360" w:after="80"/>
         <w:ind w:firstLine="0"/>
         <w:jc w:val="both"/>
       </w:pPr>
@@ -11434,7 +11436,7 @@
     <w:p>
       <w:pPr>
         <w:pStyle w:val="Heading1"/>
-        <w:spacing w:after="0" w:before="280"/>
+        <w:spacing w:after="0" w:before="360"/>
       </w:pPr>
       <w:r>
         <w:t>S4. Sensitivity analysis</w:t>
@@ -11443,7 +11445,7 @@
     <w:p>
       <w:pPr>
         <w:pStyle w:val="BodyText"/>
-        <w:spacing w:before="0" w:after="120" w:line="276" w:lineRule="auto"/>
+        <w:spacing w:before="0" w:after="120" w:line="360" w:lineRule="auto"/>
         <w:ind w:firstLine="0"/>
         <w:jc w:val="both"/>
       </w:pPr>
@@ -11455,7 +11457,7 @@
       <w:pPr>
         <w:pStyle w:val="Captions"/>
         <w:keepNext/>
-        <w:spacing w:line="240" w:lineRule="auto" w:before="200" w:after="80"/>
+        <w:spacing w:line="240" w:lineRule="auto" w:before="360" w:after="80"/>
         <w:ind w:firstLine="0"/>
         <w:jc w:val="both"/>
       </w:pPr>
@@ -13859,7 +13861,7 @@
       <w:pPr>
         <w:pStyle w:val="Captions"/>
         <w:keepNext/>
-        <w:spacing w:line="240" w:lineRule="auto" w:before="280" w:after="80"/>
+        <w:spacing w:line="240" w:lineRule="auto" w:before="360" w:after="80"/>
         <w:ind w:firstLine="0"/>
         <w:jc w:val="both"/>
       </w:pPr>
@@ -14521,7 +14523,7 @@
     <w:p>
       <w:pPr>
         <w:pStyle w:val="BodyText"/>
-        <w:spacing w:before="0" w:after="120" w:line="276" w:lineRule="auto"/>
+        <w:spacing w:before="360" w:after="120" w:line="360" w:lineRule="auto"/>
         <w:ind w:firstLine="0"/>
         <w:jc w:val="both"/>
       </w:pPr>
@@ -14532,7 +14534,7 @@
     <w:p>
       <w:pPr>
         <w:keepNext/>
-        <w:spacing w:after="0" w:line="240" w:lineRule="auto" w:before="200"/>
+        <w:spacing w:after="0" w:line="240" w:lineRule="auto" w:before="360"/>
         <w:ind w:firstLine="0"/>
         <w:jc w:val="center"/>
       </w:pPr>
@@ -14594,7 +14596,7 @@
       <w:pPr>
         <w:pStyle w:val="Captions"/>
         <w:keepNext w:val="0"/>
-        <w:spacing w:line="240" w:lineRule="auto" w:before="80" w:after="280"/>
+        <w:spacing w:line="240" w:lineRule="auto" w:before="80" w:after="360"/>
         <w:ind w:firstLine="0"/>
         <w:jc w:val="both"/>
       </w:pPr>
@@ -14750,7 +14752,7 @@
     <w:p>
       <w:pPr>
         <w:pStyle w:val="BodyText"/>
-        <w:spacing w:before="0" w:after="120" w:line="276" w:lineRule="auto"/>
+        <w:spacing w:before="0" w:after="120" w:line="360" w:lineRule="auto"/>
         <w:ind w:firstLine="0"/>
         <w:jc w:val="both"/>
       </w:pPr>
@@ -14762,7 +14764,7 @@
       <w:pPr>
         <w:pStyle w:val="BodyText"/>
         <w:keepNext/>
-        <w:spacing w:before="0" w:after="120" w:line="276" w:lineRule="auto"/>
+        <w:spacing w:before="0" w:after="120" w:line="360" w:lineRule="auto"/>
         <w:ind w:firstLine="0"/>
         <w:jc w:val="both"/>
       </w:pPr>
@@ -15067,7 +15069,7 @@
       <w:pPr>
         <w:pStyle w:val="BodyText"/>
         <w:keepNext w:val="0"/>
-        <w:spacing w:before="0" w:after="120" w:line="276" w:lineRule="auto"/>
+        <w:spacing w:before="0" w:after="120" w:line="360" w:lineRule="auto"/>
         <w:ind w:firstLine="0"/>
         <w:jc w:val="both"/>
       </w:pPr>
@@ -15078,7 +15080,7 @@
     <w:p>
       <w:pPr>
         <w:pStyle w:val="BodyText"/>
-        <w:spacing w:before="0" w:after="120" w:line="276" w:lineRule="auto"/>
+        <w:spacing w:before="0" w:after="120" w:line="360" w:lineRule="auto"/>
         <w:ind w:firstLine="0"/>
         <w:jc w:val="both"/>
       </w:pPr>
@@ -15090,7 +15092,7 @@
       <w:pPr>
         <w:pStyle w:val="Captions"/>
         <w:keepNext/>
-        <w:spacing w:line="240" w:lineRule="auto" w:before="200" w:after="80"/>
+        <w:spacing w:line="240" w:lineRule="auto" w:before="360" w:after="80"/>
         <w:ind w:firstLine="0"/>
         <w:jc w:val="both"/>
       </w:pPr>
@@ -15892,7 +15894,7 @@
     <w:p>
       <w:pPr>
         <w:pStyle w:val="BodyText"/>
-        <w:spacing w:before="0" w:after="120" w:line="276" w:lineRule="auto"/>
+        <w:spacing w:before="360" w:after="120" w:line="360" w:lineRule="auto"/>
         <w:ind w:firstLine="0"/>
         <w:jc w:val="both"/>
       </w:pPr>
@@ -15904,7 +15906,7 @@
       <w:pPr>
         <w:pStyle w:val="Captions"/>
         <w:keepNext/>
-        <w:spacing w:line="240" w:lineRule="auto" w:before="200" w:after="80"/>
+        <w:spacing w:line="240" w:lineRule="auto" w:before="360" w:after="80"/>
         <w:ind w:firstLine="0"/>
         <w:jc w:val="both"/>
       </w:pPr>
@@ -16918,7 +16920,7 @@
       <w:pPr>
         <w:pStyle w:val="Captions"/>
         <w:keepNext/>
-        <w:spacing w:line="240" w:lineRule="auto" w:before="280" w:after="80"/>
+        <w:spacing w:line="240" w:lineRule="auto" w:before="360" w:after="80"/>
         <w:ind w:firstLine="0"/>
         <w:jc w:val="both"/>
       </w:pPr>
@@ -18312,7 +18314,7 @@
       <w:pPr>
         <w:pStyle w:val="BodyText"/>
         <w:keepNext/>
-        <w:spacing w:before="280" w:after="0" w:line="240" w:lineRule="auto"/>
+        <w:spacing w:before="360" w:after="0" w:line="240" w:lineRule="auto"/>
         <w:ind w:firstLine="0"/>
         <w:jc w:val="center"/>
       </w:pPr>
@@ -18367,7 +18369,7 @@
       <w:pPr>
         <w:pStyle w:val="Captions"/>
         <w:keepNext w:val="0"/>
-        <w:spacing w:line="240" w:lineRule="auto" w:before="80" w:after="280"/>
+        <w:spacing w:line="240" w:lineRule="auto" w:before="80" w:after="360"/>
         <w:ind w:firstLine="0"/>
         <w:jc w:val="both"/>
       </w:pPr>
@@ -18573,7 +18575,7 @@
     <w:p>
       <w:pPr>
         <w:pStyle w:val="BodyText"/>
-        <w:spacing w:before="0" w:after="120" w:line="276" w:lineRule="auto"/>
+        <w:spacing w:before="0" w:after="120" w:line="360" w:lineRule="auto"/>
         <w:ind w:firstLine="0"/>
         <w:jc w:val="both"/>
       </w:pPr>
@@ -18585,7 +18587,7 @@
       <w:pPr>
         <w:pStyle w:val="Captions"/>
         <w:keepNext/>
-        <w:spacing w:line="240" w:lineRule="auto" w:before="200" w:after="80"/>
+        <w:spacing w:line="240" w:lineRule="auto" w:before="360" w:after="80"/>
         <w:ind w:firstLine="0"/>
         <w:jc w:val="both"/>
       </w:pPr>
@@ -19724,7 +19726,7 @@
     <w:p>
       <w:pPr>
         <w:pStyle w:val="Heading1"/>
-        <w:spacing w:before="280"/>
+        <w:spacing w:before="360"/>
       </w:pPr>
       <w:r>
         <w:t>S6. Uncertainty analysis</w:t>
@@ -19733,6 +19735,7 @@
     <w:p>
       <w:pPr>
         <w:pStyle w:val="BodyText"/>
+        <w:spacing w:line="360" w:lineRule="auto"/>
       </w:pPr>
       <w:r>
         <w:t xml:space="preserve">Uncertainty in predicted mass loss arising from the calibrated kinetic parameters </w:t>
@@ -19852,7 +19855,7 @@
     <w:p>
       <w:pPr>
         <w:pStyle w:val="BodyText"/>
-        <w:spacing w:before="0" w:after="120" w:line="276" w:lineRule="auto"/>
+        <w:spacing w:before="0" w:after="120" w:line="360" w:lineRule="auto"/>
         <w:ind w:firstLine="0"/>
         <w:jc w:val="both"/>
       </w:pPr>
@@ -19864,7 +19867,7 @@
       <w:pPr>
         <w:pStyle w:val="BodyText"/>
         <w:keepNext/>
-        <w:spacing w:before="200" w:after="0" w:line="240" w:lineRule="auto"/>
+        <w:spacing w:before="360" w:after="0" w:line="240" w:lineRule="auto"/>
         <w:ind w:firstLine="0"/>
         <w:jc w:val="center"/>
       </w:pPr>
@@ -19926,7 +19929,7 @@
       <w:pPr>
         <w:pStyle w:val="Captions"/>
         <w:keepNext w:val="0"/>
-        <w:spacing w:line="240" w:lineRule="auto" w:before="80" w:after="280"/>
+        <w:spacing w:line="240" w:lineRule="auto" w:before="80" w:after="360"/>
         <w:ind w:firstLine="0"/>
         <w:jc w:val="both"/>
       </w:pPr>
@@ -20022,7 +20025,7 @@
     <w:p>
       <w:pPr>
         <w:pStyle w:val="BodyText"/>
-        <w:spacing w:before="0" w:after="120" w:line="276" w:lineRule="auto"/>
+        <w:spacing w:before="0" w:after="120" w:line="360" w:lineRule="auto"/>
         <w:ind w:firstLine="0"/>
         <w:jc w:val="both"/>
       </w:pPr>
@@ -20034,7 +20037,7 @@
       <w:pPr>
         <w:pStyle w:val="BodyText"/>
         <w:keepNext/>
-        <w:spacing w:before="200" w:after="0" w:line="240" w:lineRule="auto"/>
+        <w:spacing w:before="360" w:after="0" w:line="240" w:lineRule="auto"/>
         <w:ind w:firstLine="0"/>
         <w:jc w:val="center"/>
       </w:pPr>
@@ -20096,7 +20099,7 @@
       <w:pPr>
         <w:pStyle w:val="Captions"/>
         <w:keepNext w:val="0"/>
-        <w:spacing w:line="240" w:lineRule="auto" w:before="80" w:after="280"/>
+        <w:spacing w:line="240" w:lineRule="auto" w:before="80" w:after="360"/>
         <w:ind w:firstLine="0"/>
         <w:jc w:val="both"/>
       </w:pPr>
@@ -20235,7 +20238,7 @@
       <w:pPr>
         <w:pStyle w:val="Captions"/>
         <w:keepNext/>
-        <w:spacing w:line="240" w:lineRule="auto" w:before="200" w:after="80"/>
+        <w:spacing w:line="240" w:lineRule="auto" w:before="360" w:after="80"/>
         <w:ind w:firstLine="0"/>
         <w:jc w:val="both"/>
       </w:pPr>
@@ -22392,7 +22395,7 @@
     <w:p>
       <w:pPr>
         <w:keepNext/>
-        <w:spacing w:after="0" w:line="240" w:lineRule="auto" w:before="280"/>
+        <w:spacing w:after="0" w:line="240" w:lineRule="auto" w:before="360"/>
         <w:ind w:firstLine="0"/>
         <w:jc w:val="center"/>
       </w:pPr>
@@ -22454,7 +22457,7 @@
       <w:pPr>
         <w:pStyle w:val="Captions"/>
         <w:keepNext w:val="0"/>
-        <w:spacing w:line="240" w:lineRule="auto" w:before="80" w:after="280"/>
+        <w:spacing w:line="240" w:lineRule="auto" w:before="80" w:after="360"/>
         <w:ind w:firstLine="0"/>
         <w:jc w:val="both"/>
         <w:rPr>
@@ -22580,7 +22583,7 @@
     <w:p>
       <w:pPr>
         <w:keepNext/>
-        <w:spacing w:after="0" w:line="240" w:lineRule="auto" w:before="200"/>
+        <w:spacing w:after="0" w:line="240" w:lineRule="auto" w:before="360"/>
         <w:ind w:firstLine="0"/>
         <w:jc w:val="center"/>
         <w:rPr>
@@ -22648,7 +22651,7 @@
       <w:pPr>
         <w:pStyle w:val="Captions"/>
         <w:keepNext w:val="0"/>
-        <w:spacing w:line="240" w:lineRule="auto" w:before="80" w:after="280"/>
+        <w:spacing w:line="240" w:lineRule="auto" w:before="80" w:after="360"/>
         <w:ind w:firstLine="0"/>
         <w:jc w:val="both"/>
       </w:pPr>

</xml_diff>

<commit_message>
Workbook figure-sheet pass fixes; SI contents table lists Equations S4/S5
Co-Authored-By: Claude Sonnet 5.5 <noreply@anthropic.com>
Claude-Session: https://claude.ai/code/session_01Y1g9vByMLTE8eGJ9K81zt6
</commit_message>
<xml_diff>
--- a/Supplementary_reorganized.docx
+++ b/Supplementary_reorganized.docx
@@ -403,7 +403,7 @@
                 <w:sz w:val="20"/>
                 <w:szCs w:val="20"/>
               </w:rPr>
-              <w:t>Tables S2–S3; Figures S3–S4</w:t>
+              <w:t xml:space="preserve">Equation S4; Tables S2–S3; Figures S3–S4</w:t>
             </w:r>
           </w:p>
         </w:tc>
@@ -607,7 +607,7 @@
                 <w:sz w:val="20"/>
                 <w:szCs w:val="20"/>
               </w:rPr>
-              <w:t>Tables S7–S10; Figure S6</w:t>
+              <w:t xml:space="preserve">Equation S5; Tables S7–S10; Figure S6</w:t>
             </w:r>
           </w:p>
         </w:tc>

</xml_diff>